<commit_message>
update final paper document
</commit_message>
<xml_diff>
--- a/paper/Dry_Bean_机器学习课程论文.docx
+++ b/paper/Dry_Bean_机器学习课程论文.docx
@@ -87,60 +87,6 @@
           <w:lang w:eastAsia="zh-CN"/>
         </w:rPr>
       </w:pPr>
-      <w:r>
-        <w:rPr>
-          <w:rFonts w:cs="宋体"/>
-          <w:sz w:val="24"/>
-          <w:szCs w:val="24"/>
-          <w:lang w:eastAsia="zh-CN"/>
-        </w:rPr>
-        <w:t>数据分析</w:t>
-      </w:r>
-      <w:r>
-        <w:rPr>
-          <w:rFonts w:cs="宋体"/>
-          <w:sz w:val="24"/>
-          <w:szCs w:val="24"/>
-          <w:lang w:eastAsia="zh-CN"/>
-        </w:rPr>
-        <w:t xml:space="preserve">   </w:t>
-      </w:r>
-      <w:r>
-        <w:rPr>
-          <w:rFonts w:cs="宋体"/>
-          <w:sz w:val="24"/>
-          <w:szCs w:val="24"/>
-          <w:lang w:eastAsia="zh-CN"/>
-        </w:rPr>
-        <w:t>数据清洗 · 五算法实验</w:t>
-      </w:r>
-      <w:r>
-        <w:rPr>
-          <w:rFonts w:cs="宋体"/>
-          <w:sz w:val="24"/>
-          <w:szCs w:val="24"/>
-          <w:lang w:eastAsia="zh-CN"/>
-        </w:rPr>
-        <w:t>分析</w:t>
-      </w:r>
-      <w:r>
-        <w:rPr>
-          <w:rFonts w:cs="宋体"/>
-          <w:sz w:val="24"/>
-          <w:szCs w:val="24"/>
-          <w:lang w:eastAsia="zh-CN"/>
-        </w:rPr>
-        <w:t xml:space="preserve"> · 系统展示</w:t>
-      </w:r>
-      <w:r>
-        <w:rPr>
-          <w:rFonts w:cs="宋体"/>
-          <w:sz w:val="24"/>
-          <w:szCs w:val="24"/>
-          <w:lang w:eastAsia="zh-CN"/>
-        </w:rPr>
-        <w:t xml:space="preserve">   课程总结</w:t>
-      </w:r>
     </w:p>
     <w:tbl>
       <w:tblPr>
@@ -9656,15 +9602,6 @@
         </w:rPr>
         <w:t>实验使用 Python 3.11，主要依赖 pandas、NumPy、scikit-learn 和 XGBoost。随机种子固定为 42。五种算法使用相同的训练、验证和测试划分；不同算法只在是否标准化方面按其机制区分。</w:t>
       </w:r>
-      <w:r>
-        <w:rPr>
-          <w:rFonts w:cs="宋体"/>
-          <w:sz w:val="24"/>
-          <w:szCs w:val="24"/>
-          <w:lang w:eastAsia="zh-CN"/>
-        </w:rPr>
-        <w:t>模型选择不读取测试标签，最终结果统一写入 CSV，论文和展示网页从同一份结果文件读取，避免数字不一致。</w:t>
-      </w:r>
     </w:p>
     <w:p>
       <w:pPr>
@@ -9706,9 +9643,719 @@
         <w:tblLook w:val="04A0" w:firstRow="1" w:lastRow="0" w:firstColumn="1" w:lastColumn="0" w:noHBand="0" w:noVBand="1"/>
       </w:tblPr>
       <w:tblGrid>
+        <w:gridCol w:w="2054"/>
+        <w:gridCol w:w="3773"/>
+        <w:gridCol w:w="3283"/>
+      </w:tblGrid>
+      <w:tr>
+        <w:trPr>
+          <w:tblHeader/>
+          <w:jc w:val="center"/>
+        </w:trPr>
+        <w:tc>
+          <w:tcPr>
+            <w:tcW w:w="2054" w:type="dxa"/>
+            <w:shd w:val="clear" w:color="auto" w:fill="E9F1EC"/>
+            <w:tcMar>
+              <w:top w:w="90" w:type="dxa"/>
+              <w:left w:w="120" w:type="dxa"/>
+              <w:bottom w:w="90" w:type="dxa"/>
+              <w:right w:w="120" w:type="dxa"/>
+            </w:tcMar>
+            <w:vAlign w:val="center"/>
+          </w:tcPr>
+          <w:p>
+            <w:pPr>
+              <w:spacing w:line="360" w:lineRule="auto"/>
+              <w:rPr>
+                <w:rFonts w:cs="宋体" w:hint="eastAsia"/>
+                <w:sz w:val="24"/>
+                <w:szCs w:val="24"/>
+              </w:rPr>
+            </w:pPr>
+            <w:proofErr w:type="spellStart"/>
+            <w:r>
+              <w:rPr>
+                <w:rFonts w:cs="宋体"/>
+                <w:b/>
+                <w:sz w:val="24"/>
+                <w:szCs w:val="24"/>
+              </w:rPr>
+              <w:t>指标</w:t>
+            </w:r>
+            <w:proofErr w:type="spellEnd"/>
+          </w:p>
+        </w:tc>
+        <w:tc>
+          <w:tcPr>
+            <w:tcW w:w="3773" w:type="dxa"/>
+            <w:shd w:val="clear" w:color="auto" w:fill="E9F1EC"/>
+            <w:tcMar>
+              <w:top w:w="90" w:type="dxa"/>
+              <w:left w:w="120" w:type="dxa"/>
+              <w:bottom w:w="90" w:type="dxa"/>
+              <w:right w:w="120" w:type="dxa"/>
+            </w:tcMar>
+            <w:vAlign w:val="center"/>
+          </w:tcPr>
+          <w:p>
+            <w:pPr>
+              <w:spacing w:line="360" w:lineRule="auto"/>
+              <w:rPr>
+                <w:rFonts w:cs="宋体" w:hint="eastAsia"/>
+                <w:sz w:val="24"/>
+                <w:szCs w:val="24"/>
+              </w:rPr>
+            </w:pPr>
+            <w:r>
+              <w:rPr>
+                <w:rFonts w:cs="宋体"/>
+                <w:b/>
+                <w:sz w:val="24"/>
+                <w:szCs w:val="24"/>
+              </w:rPr>
+              <w:t>计算口径</w:t>
+            </w:r>
+          </w:p>
+        </w:tc>
+        <w:tc>
+          <w:tcPr>
+            <w:tcW w:w="3283" w:type="dxa"/>
+            <w:shd w:val="clear" w:color="auto" w:fill="E9F1EC"/>
+            <w:tcMar>
+              <w:top w:w="90" w:type="dxa"/>
+              <w:left w:w="120" w:type="dxa"/>
+              <w:bottom w:w="90" w:type="dxa"/>
+              <w:right w:w="120" w:type="dxa"/>
+            </w:tcMar>
+            <w:vAlign w:val="center"/>
+          </w:tcPr>
+          <w:p>
+            <w:pPr>
+              <w:spacing w:line="360" w:lineRule="auto"/>
+              <w:rPr>
+                <w:rFonts w:cs="宋体" w:hint="eastAsia"/>
+                <w:sz w:val="24"/>
+                <w:szCs w:val="24"/>
+              </w:rPr>
+            </w:pPr>
+            <w:r>
+              <w:rPr>
+                <w:rFonts w:cs="宋体"/>
+                <w:b/>
+                <w:sz w:val="24"/>
+                <w:szCs w:val="24"/>
+              </w:rPr>
+              <w:t>作用</w:t>
+            </w:r>
+          </w:p>
+        </w:tc>
+      </w:tr>
+      <w:tr>
+        <w:trPr>
+          <w:jc w:val="center"/>
+        </w:trPr>
+        <w:tc>
+          <w:tcPr>
+            <w:tcW w:w="2054" w:type="dxa"/>
+            <w:tcMar>
+              <w:top w:w="90" w:type="dxa"/>
+              <w:left w:w="120" w:type="dxa"/>
+              <w:bottom w:w="90" w:type="dxa"/>
+              <w:right w:w="120" w:type="dxa"/>
+            </w:tcMar>
+            <w:vAlign w:val="center"/>
+          </w:tcPr>
+          <w:p>
+            <w:pPr>
+              <w:spacing w:line="360" w:lineRule="auto"/>
+              <w:rPr>
+                <w:rFonts w:cs="宋体" w:hint="eastAsia"/>
+                <w:sz w:val="24"/>
+                <w:szCs w:val="24"/>
+              </w:rPr>
+            </w:pPr>
+            <w:r>
+              <w:rPr>
+                <w:rFonts w:cs="宋体"/>
+                <w:sz w:val="24"/>
+                <w:szCs w:val="24"/>
+              </w:rPr>
+              <w:t>Accuracy</w:t>
+            </w:r>
+          </w:p>
+        </w:tc>
+        <w:tc>
+          <w:tcPr>
+            <w:tcW w:w="3773" w:type="dxa"/>
+            <w:tcMar>
+              <w:top w:w="90" w:type="dxa"/>
+              <w:left w:w="120" w:type="dxa"/>
+              <w:bottom w:w="90" w:type="dxa"/>
+              <w:right w:w="120" w:type="dxa"/>
+            </w:tcMar>
+            <w:vAlign w:val="center"/>
+          </w:tcPr>
+          <w:p>
+            <w:pPr>
+              <w:spacing w:line="360" w:lineRule="auto"/>
+              <w:rPr>
+                <w:rFonts w:cs="宋体" w:hint="eastAsia"/>
+                <w:sz w:val="24"/>
+                <w:szCs w:val="24"/>
+                <w:lang w:eastAsia="zh-CN"/>
+              </w:rPr>
+            </w:pPr>
+            <w:r>
+              <w:rPr>
+                <w:rFonts w:cs="宋体"/>
+                <w:sz w:val="24"/>
+                <w:szCs w:val="24"/>
+                <w:lang w:eastAsia="zh-CN"/>
+              </w:rPr>
+              <w:t>正确分类样本数 / 总样本数</w:t>
+            </w:r>
+          </w:p>
+        </w:tc>
+        <w:tc>
+          <w:tcPr>
+            <w:tcW w:w="3283" w:type="dxa"/>
+            <w:tcMar>
+              <w:top w:w="90" w:type="dxa"/>
+              <w:left w:w="120" w:type="dxa"/>
+              <w:bottom w:w="90" w:type="dxa"/>
+              <w:right w:w="120" w:type="dxa"/>
+            </w:tcMar>
+            <w:vAlign w:val="center"/>
+          </w:tcPr>
+          <w:p>
+            <w:pPr>
+              <w:spacing w:line="360" w:lineRule="auto"/>
+              <w:rPr>
+                <w:rFonts w:cs="宋体" w:hint="eastAsia"/>
+                <w:sz w:val="24"/>
+                <w:szCs w:val="24"/>
+              </w:rPr>
+            </w:pPr>
+            <w:proofErr w:type="spellStart"/>
+            <w:r>
+              <w:rPr>
+                <w:rFonts w:cs="宋体"/>
+                <w:sz w:val="24"/>
+                <w:szCs w:val="24"/>
+              </w:rPr>
+              <w:t>总体正确率</w:t>
+            </w:r>
+            <w:proofErr w:type="spellEnd"/>
+          </w:p>
+        </w:tc>
+      </w:tr>
+      <w:tr>
+        <w:trPr>
+          <w:jc w:val="center"/>
+        </w:trPr>
+        <w:tc>
+          <w:tcPr>
+            <w:tcW w:w="2054" w:type="dxa"/>
+            <w:tcMar>
+              <w:top w:w="90" w:type="dxa"/>
+              <w:left w:w="120" w:type="dxa"/>
+              <w:bottom w:w="90" w:type="dxa"/>
+              <w:right w:w="120" w:type="dxa"/>
+            </w:tcMar>
+            <w:vAlign w:val="center"/>
+          </w:tcPr>
+          <w:p>
+            <w:pPr>
+              <w:spacing w:line="360" w:lineRule="auto"/>
+              <w:rPr>
+                <w:rFonts w:cs="宋体" w:hint="eastAsia"/>
+                <w:sz w:val="24"/>
+                <w:szCs w:val="24"/>
+              </w:rPr>
+            </w:pPr>
+            <w:r>
+              <w:rPr>
+                <w:rFonts w:cs="宋体"/>
+                <w:sz w:val="24"/>
+                <w:szCs w:val="24"/>
+              </w:rPr>
+              <w:t>Macro-F1</w:t>
+            </w:r>
+          </w:p>
+        </w:tc>
+        <w:tc>
+          <w:tcPr>
+            <w:tcW w:w="3773" w:type="dxa"/>
+            <w:tcMar>
+              <w:top w:w="90" w:type="dxa"/>
+              <w:left w:w="120" w:type="dxa"/>
+              <w:bottom w:w="90" w:type="dxa"/>
+              <w:right w:w="120" w:type="dxa"/>
+            </w:tcMar>
+            <w:vAlign w:val="center"/>
+          </w:tcPr>
+          <w:p>
+            <w:pPr>
+              <w:spacing w:line="360" w:lineRule="auto"/>
+              <w:rPr>
+                <w:rFonts w:cs="宋体" w:hint="eastAsia"/>
+                <w:sz w:val="24"/>
+                <w:szCs w:val="24"/>
+              </w:rPr>
+            </w:pPr>
+            <w:r>
+              <w:rPr>
+                <w:rFonts w:cs="宋体"/>
+                <w:sz w:val="24"/>
+                <w:szCs w:val="24"/>
+              </w:rPr>
+              <w:t>各类别 F1 的算术平均</w:t>
+            </w:r>
+          </w:p>
+        </w:tc>
+        <w:tc>
+          <w:tcPr>
+            <w:tcW w:w="3283" w:type="dxa"/>
+            <w:tcMar>
+              <w:top w:w="90" w:type="dxa"/>
+              <w:left w:w="120" w:type="dxa"/>
+              <w:bottom w:w="90" w:type="dxa"/>
+              <w:right w:w="120" w:type="dxa"/>
+            </w:tcMar>
+            <w:vAlign w:val="center"/>
+          </w:tcPr>
+          <w:p>
+            <w:pPr>
+              <w:spacing w:line="360" w:lineRule="auto"/>
+              <w:rPr>
+                <w:rFonts w:cs="宋体" w:hint="eastAsia"/>
+                <w:sz w:val="24"/>
+                <w:szCs w:val="24"/>
+              </w:rPr>
+            </w:pPr>
+            <w:r>
+              <w:rPr>
+                <w:rFonts w:cs="宋体"/>
+                <w:sz w:val="24"/>
+                <w:szCs w:val="24"/>
+              </w:rPr>
+              <w:t>减少类别不平衡影响</w:t>
+            </w:r>
+          </w:p>
+        </w:tc>
+      </w:tr>
+      <w:tr>
+        <w:trPr>
+          <w:jc w:val="center"/>
+        </w:trPr>
+        <w:tc>
+          <w:tcPr>
+            <w:tcW w:w="2054" w:type="dxa"/>
+            <w:tcMar>
+              <w:top w:w="90" w:type="dxa"/>
+              <w:left w:w="120" w:type="dxa"/>
+              <w:bottom w:w="90" w:type="dxa"/>
+              <w:right w:w="120" w:type="dxa"/>
+            </w:tcMar>
+            <w:vAlign w:val="center"/>
+          </w:tcPr>
+          <w:p>
+            <w:pPr>
+              <w:spacing w:line="360" w:lineRule="auto"/>
+              <w:rPr>
+                <w:rFonts w:cs="宋体" w:hint="eastAsia"/>
+                <w:sz w:val="24"/>
+                <w:szCs w:val="24"/>
+              </w:rPr>
+            </w:pPr>
+            <w:r>
+              <w:rPr>
+                <w:rFonts w:cs="宋体"/>
+                <w:sz w:val="24"/>
+                <w:szCs w:val="24"/>
+              </w:rPr>
+              <w:t>Log Loss</w:t>
+            </w:r>
+          </w:p>
+        </w:tc>
+        <w:tc>
+          <w:tcPr>
+            <w:tcW w:w="3773" w:type="dxa"/>
+            <w:tcMar>
+              <w:top w:w="90" w:type="dxa"/>
+              <w:left w:w="120" w:type="dxa"/>
+              <w:bottom w:w="90" w:type="dxa"/>
+              <w:right w:w="120" w:type="dxa"/>
+            </w:tcMar>
+            <w:vAlign w:val="center"/>
+          </w:tcPr>
+          <w:p>
+            <w:pPr>
+              <w:spacing w:line="360" w:lineRule="auto"/>
+              <w:rPr>
+                <w:rFonts w:cs="宋体" w:hint="eastAsia"/>
+                <w:sz w:val="24"/>
+                <w:szCs w:val="24"/>
+              </w:rPr>
+            </w:pPr>
+            <w:r>
+              <w:rPr>
+                <w:rFonts w:cs="宋体"/>
+                <w:sz w:val="24"/>
+                <w:szCs w:val="24"/>
+              </w:rPr>
+              <w:t>−Σ y·log(p)</w:t>
+            </w:r>
+          </w:p>
+        </w:tc>
+        <w:tc>
+          <w:tcPr>
+            <w:tcW w:w="3283" w:type="dxa"/>
+            <w:tcMar>
+              <w:top w:w="90" w:type="dxa"/>
+              <w:left w:w="120" w:type="dxa"/>
+              <w:bottom w:w="90" w:type="dxa"/>
+              <w:right w:w="120" w:type="dxa"/>
+            </w:tcMar>
+            <w:vAlign w:val="center"/>
+          </w:tcPr>
+          <w:p>
+            <w:pPr>
+              <w:spacing w:line="360" w:lineRule="auto"/>
+              <w:rPr>
+                <w:rFonts w:cs="宋体" w:hint="eastAsia"/>
+                <w:sz w:val="24"/>
+                <w:szCs w:val="24"/>
+                <w:lang w:eastAsia="zh-CN"/>
+              </w:rPr>
+            </w:pPr>
+            <w:r>
+              <w:rPr>
+                <w:rFonts w:cs="宋体"/>
+                <w:sz w:val="24"/>
+                <w:szCs w:val="24"/>
+                <w:lang w:eastAsia="zh-CN"/>
+              </w:rPr>
+              <w:t>评价概率预测与训练收敛</w:t>
+            </w:r>
+          </w:p>
+        </w:tc>
+      </w:tr>
+      <w:tr>
+        <w:trPr>
+          <w:jc w:val="center"/>
+        </w:trPr>
+        <w:tc>
+          <w:tcPr>
+            <w:tcW w:w="2054" w:type="dxa"/>
+            <w:tcMar>
+              <w:top w:w="90" w:type="dxa"/>
+              <w:left w:w="120" w:type="dxa"/>
+              <w:bottom w:w="90" w:type="dxa"/>
+              <w:right w:w="120" w:type="dxa"/>
+            </w:tcMar>
+            <w:vAlign w:val="center"/>
+          </w:tcPr>
+          <w:p>
+            <w:pPr>
+              <w:spacing w:line="360" w:lineRule="auto"/>
+              <w:rPr>
+                <w:rFonts w:cs="宋体" w:hint="eastAsia"/>
+                <w:sz w:val="24"/>
+                <w:szCs w:val="24"/>
+              </w:rPr>
+            </w:pPr>
+            <w:proofErr w:type="spellStart"/>
+            <w:r>
+              <w:rPr>
+                <w:rFonts w:cs="宋体"/>
+                <w:sz w:val="24"/>
+                <w:szCs w:val="24"/>
+              </w:rPr>
+              <w:t>推理时间</w:t>
+            </w:r>
+            <w:proofErr w:type="spellEnd"/>
+          </w:p>
+        </w:tc>
+        <w:tc>
+          <w:tcPr>
+            <w:tcW w:w="3773" w:type="dxa"/>
+            <w:tcMar>
+              <w:top w:w="90" w:type="dxa"/>
+              <w:left w:w="120" w:type="dxa"/>
+              <w:bottom w:w="90" w:type="dxa"/>
+              <w:right w:w="120" w:type="dxa"/>
+            </w:tcMar>
+            <w:vAlign w:val="center"/>
+          </w:tcPr>
+          <w:p>
+            <w:pPr>
+              <w:spacing w:line="360" w:lineRule="auto"/>
+              <w:rPr>
+                <w:rFonts w:cs="宋体" w:hint="eastAsia"/>
+                <w:sz w:val="24"/>
+                <w:szCs w:val="24"/>
+                <w:lang w:eastAsia="zh-CN"/>
+              </w:rPr>
+            </w:pPr>
+            <w:r>
+              <w:rPr>
+                <w:rFonts w:cs="宋体"/>
+                <w:sz w:val="24"/>
+                <w:szCs w:val="24"/>
+                <w:lang w:eastAsia="zh-CN"/>
+              </w:rPr>
+              <w:t>多次预热后批量预测中位数</w:t>
+            </w:r>
+          </w:p>
+        </w:tc>
+        <w:tc>
+          <w:tcPr>
+            <w:tcW w:w="3283" w:type="dxa"/>
+            <w:tcMar>
+              <w:top w:w="90" w:type="dxa"/>
+              <w:left w:w="120" w:type="dxa"/>
+              <w:bottom w:w="90" w:type="dxa"/>
+              <w:right w:w="120" w:type="dxa"/>
+            </w:tcMar>
+            <w:vAlign w:val="center"/>
+          </w:tcPr>
+          <w:p>
+            <w:pPr>
+              <w:spacing w:line="360" w:lineRule="auto"/>
+              <w:rPr>
+                <w:rFonts w:cs="宋体" w:hint="eastAsia"/>
+                <w:sz w:val="24"/>
+                <w:szCs w:val="24"/>
+              </w:rPr>
+            </w:pPr>
+            <w:proofErr w:type="spellStart"/>
+            <w:r>
+              <w:rPr>
+                <w:rFonts w:cs="宋体"/>
+                <w:sz w:val="24"/>
+                <w:szCs w:val="24"/>
+              </w:rPr>
+              <w:t>评价在线预测成本</w:t>
+            </w:r>
+            <w:proofErr w:type="spellEnd"/>
+          </w:p>
+        </w:tc>
+      </w:tr>
+      <w:tr>
+        <w:trPr>
+          <w:jc w:val="center"/>
+        </w:trPr>
+        <w:tc>
+          <w:tcPr>
+            <w:tcW w:w="2054" w:type="dxa"/>
+            <w:tcMar>
+              <w:top w:w="90" w:type="dxa"/>
+              <w:left w:w="120" w:type="dxa"/>
+              <w:bottom w:w="90" w:type="dxa"/>
+              <w:right w:w="120" w:type="dxa"/>
+            </w:tcMar>
+            <w:vAlign w:val="center"/>
+          </w:tcPr>
+          <w:p>
+            <w:pPr>
+              <w:spacing w:line="360" w:lineRule="auto"/>
+              <w:rPr>
+                <w:rFonts w:cs="宋体" w:hint="eastAsia"/>
+                <w:sz w:val="24"/>
+                <w:szCs w:val="24"/>
+              </w:rPr>
+            </w:pPr>
+            <w:r>
+              <w:rPr>
+                <w:rFonts w:cs="宋体"/>
+                <w:sz w:val="24"/>
+                <w:szCs w:val="24"/>
+              </w:rPr>
+              <w:t>过拟合差距</w:t>
+            </w:r>
+          </w:p>
+        </w:tc>
+        <w:tc>
+          <w:tcPr>
+            <w:tcW w:w="3773" w:type="dxa"/>
+            <w:tcMar>
+              <w:top w:w="90" w:type="dxa"/>
+              <w:left w:w="120" w:type="dxa"/>
+              <w:bottom w:w="90" w:type="dxa"/>
+              <w:right w:w="120" w:type="dxa"/>
+            </w:tcMar>
+            <w:vAlign w:val="center"/>
+          </w:tcPr>
+          <w:p>
+            <w:pPr>
+              <w:spacing w:line="360" w:lineRule="auto"/>
+              <w:rPr>
+                <w:rFonts w:cs="宋体" w:hint="eastAsia"/>
+                <w:sz w:val="24"/>
+                <w:szCs w:val="24"/>
+              </w:rPr>
+            </w:pPr>
+            <w:r>
+              <w:rPr>
+                <w:rFonts w:cs="宋体"/>
+                <w:sz w:val="24"/>
+                <w:szCs w:val="24"/>
+              </w:rPr>
+              <w:t>训练指标 − 测试指标</w:t>
+            </w:r>
+          </w:p>
+        </w:tc>
+        <w:tc>
+          <w:tcPr>
+            <w:tcW w:w="3283" w:type="dxa"/>
+            <w:tcMar>
+              <w:top w:w="90" w:type="dxa"/>
+              <w:left w:w="120" w:type="dxa"/>
+              <w:bottom w:w="90" w:type="dxa"/>
+              <w:right w:w="120" w:type="dxa"/>
+            </w:tcMar>
+            <w:vAlign w:val="center"/>
+          </w:tcPr>
+          <w:p>
+            <w:pPr>
+              <w:spacing w:line="360" w:lineRule="auto"/>
+              <w:rPr>
+                <w:rFonts w:cs="宋体" w:hint="eastAsia"/>
+                <w:sz w:val="24"/>
+                <w:szCs w:val="24"/>
+              </w:rPr>
+            </w:pPr>
+            <w:r>
+              <w:rPr>
+                <w:rFonts w:cs="宋体"/>
+                <w:sz w:val="24"/>
+                <w:szCs w:val="24"/>
+              </w:rPr>
+              <w:t>评价泛化差距</w:t>
+            </w:r>
+          </w:p>
+        </w:tc>
+      </w:tr>
+    </w:tbl>
+    <w:p>
+      <w:pPr>
+        <w:spacing w:after="40"/>
+        <w:rPr>
+          <w:rFonts w:hint="eastAsia"/>
+        </w:rPr>
+      </w:pPr>
+    </w:p>
+    <w:p>
+      <w:pPr>
+        <w:spacing w:line="360" w:lineRule="auto"/>
+        <w:jc w:val="center"/>
+        <w:rPr>
+          <w:rFonts w:cs="宋体" w:hint="eastAsia"/>
+          <w:sz w:val="24"/>
+          <w:szCs w:val="24"/>
+          <w:lang w:eastAsia="zh-CN"/>
+        </w:rPr>
+      </w:pPr>
+      <w:r>
+        <w:rPr>
+          <w:rFonts w:cs="宋体"/>
+          <w:sz w:val="24"/>
+          <w:szCs w:val="24"/>
+          <w:lang w:eastAsia="zh-CN"/>
+        </w:rPr>
+        <w:t>表5-1 主要评价指标</w:t>
+      </w:r>
+    </w:p>
+    <w:p>
+      <w:pPr>
+        <w:pStyle w:val="21"/>
+        <w:spacing w:beforeLines="50" w:before="120" w:afterLines="50" w:line="360" w:lineRule="auto"/>
+        <w:rPr>
+          <w:rFonts w:ascii="黑体" w:eastAsia="黑体" w:hAnsi="黑体" w:cs="黑体" w:hint="eastAsia"/>
+          <w:sz w:val="28"/>
+          <w:szCs w:val="28"/>
+          <w:lang w:eastAsia="zh-CN"/>
+        </w:rPr>
+      </w:pPr>
+      <w:bookmarkStart w:id="24" w:name="_Toc233156923"/>
+      <w:r>
+        <w:rPr>
+          <w:rFonts w:ascii="黑体" w:eastAsia="黑体" w:hAnsi="黑体" w:cs="黑体"/>
+          <w:sz w:val="28"/>
+          <w:szCs w:val="28"/>
+          <w:lang w:eastAsia="zh-CN"/>
+        </w:rPr>
+        <w:t>5.3 额外对比维度</w:t>
+      </w:r>
+      <w:bookmarkEnd w:id="24"/>
+    </w:p>
+    <w:p>
+      <w:pPr>
+        <w:spacing w:line="360" w:lineRule="auto"/>
+        <w:ind w:firstLineChars="200" w:firstLine="480"/>
+        <w:rPr>
+          <w:rFonts w:cs="宋体" w:hint="eastAsia"/>
+          <w:sz w:val="24"/>
+          <w:szCs w:val="24"/>
+          <w:lang w:eastAsia="zh-CN"/>
+        </w:rPr>
+      </w:pPr>
+      <w:r>
+        <w:rPr>
+          <w:rFonts w:cs="宋体"/>
+          <w:sz w:val="24"/>
+          <w:szCs w:val="24"/>
+          <w:lang w:eastAsia="zh-CN"/>
+        </w:rPr>
+        <w:t>在要求之外，本文只保留四项信息增益较高的维度：Macro-F1、训练时间、模型文件大小和特征工程消融。训练时间与推理时间共同反映计算成本；模型大小反映存储成本；消融实验直接证明数据处理是否带来收益。</w:t>
+      </w:r>
+    </w:p>
+    <w:p>
+      <w:pPr>
+        <w:pStyle w:val="21"/>
+        <w:spacing w:beforeLines="50" w:before="120" w:afterLines="50" w:line="360" w:lineRule="auto"/>
+        <w:rPr>
+          <w:rFonts w:ascii="黑体" w:eastAsia="黑体" w:hAnsi="黑体" w:cs="黑体" w:hint="eastAsia"/>
+          <w:sz w:val="28"/>
+          <w:szCs w:val="28"/>
+        </w:rPr>
+      </w:pPr>
+      <w:bookmarkStart w:id="25" w:name="_Toc233156924"/>
+      <w:r>
+        <w:rPr>
+          <w:rFonts w:ascii="黑体" w:eastAsia="黑体" w:hAnsi="黑体" w:cs="黑体"/>
+          <w:sz w:val="28"/>
+          <w:szCs w:val="28"/>
+        </w:rPr>
+        <w:lastRenderedPageBreak/>
+        <w:t xml:space="preserve">5.4 </w:t>
+      </w:r>
+      <w:proofErr w:type="spellStart"/>
+      <w:r>
+        <w:rPr>
+          <w:rFonts w:ascii="黑体" w:eastAsia="黑体" w:hAnsi="黑体" w:cs="黑体"/>
+          <w:sz w:val="28"/>
+          <w:szCs w:val="28"/>
+        </w:rPr>
+        <w:t>鲁棒性实验</w:t>
+      </w:r>
+      <w:bookmarkEnd w:id="25"/>
+      <w:proofErr w:type="spellEnd"/>
+    </w:p>
+    <w:tbl>
+      <w:tblPr>
+        <w:tblStyle w:val="aff1"/>
+        <w:tblW w:w="0" w:type="auto"/>
+        <w:jc w:val="center"/>
+        <w:tblLayout w:type="fixed"/>
+        <w:tblLook w:val="04A0" w:firstRow="1" w:lastRow="0" w:firstColumn="1" w:lastColumn="0" w:noHBand="0" w:noVBand="1"/>
+      </w:tblPr>
+      <w:tblGrid>
         <w:gridCol w:w="1800"/>
-        <w:gridCol w:w="3456"/>
-        <w:gridCol w:w="3600"/>
+        <w:gridCol w:w="3083"/>
+        <w:gridCol w:w="4324"/>
       </w:tblGrid>
       <w:tr>
         <w:trPr>
@@ -9744,14 +10391,14 @@
                 <w:sz w:val="24"/>
                 <w:szCs w:val="24"/>
               </w:rPr>
-              <w:t>指标</w:t>
+              <w:t>噪声类型</w:t>
             </w:r>
             <w:proofErr w:type="spellEnd"/>
           </w:p>
         </w:tc>
         <w:tc>
           <w:tcPr>
-            <w:tcW w:w="3456" w:type="dxa"/>
+            <w:tcW w:w="3083" w:type="dxa"/>
             <w:shd w:val="clear" w:color="auto" w:fill="E9F1EC"/>
             <w:tcMar>
               <w:top w:w="90" w:type="dxa"/>
@@ -9777,721 +10424,13 @@
                 <w:sz w:val="24"/>
                 <w:szCs w:val="24"/>
               </w:rPr>
-              <w:t>计算口径</w:t>
-            </w:r>
-          </w:p>
-        </w:tc>
-        <w:tc>
-          <w:tcPr>
-            <w:tcW w:w="3600" w:type="dxa"/>
-            <w:shd w:val="clear" w:color="auto" w:fill="E9F1EC"/>
-            <w:tcMar>
-              <w:top w:w="90" w:type="dxa"/>
-              <w:left w:w="120" w:type="dxa"/>
-              <w:bottom w:w="90" w:type="dxa"/>
-              <w:right w:w="120" w:type="dxa"/>
-            </w:tcMar>
-            <w:vAlign w:val="center"/>
-          </w:tcPr>
-          <w:p>
-            <w:pPr>
-              <w:spacing w:line="360" w:lineRule="auto"/>
-              <w:rPr>
-                <w:rFonts w:cs="宋体" w:hint="eastAsia"/>
-                <w:sz w:val="24"/>
-                <w:szCs w:val="24"/>
-              </w:rPr>
-            </w:pPr>
-            <w:r>
-              <w:rPr>
-                <w:rFonts w:cs="宋体"/>
-                <w:b/>
-                <w:sz w:val="24"/>
-                <w:szCs w:val="24"/>
-              </w:rPr>
-              <w:t>作用</w:t>
-            </w:r>
-          </w:p>
-        </w:tc>
-      </w:tr>
-      <w:tr>
-        <w:trPr>
-          <w:jc w:val="center"/>
-        </w:trPr>
-        <w:tc>
-          <w:tcPr>
-            <w:tcW w:w="1800" w:type="dxa"/>
-            <w:tcMar>
-              <w:top w:w="90" w:type="dxa"/>
-              <w:left w:w="120" w:type="dxa"/>
-              <w:bottom w:w="90" w:type="dxa"/>
-              <w:right w:w="120" w:type="dxa"/>
-            </w:tcMar>
-            <w:vAlign w:val="center"/>
-          </w:tcPr>
-          <w:p>
-            <w:pPr>
-              <w:spacing w:line="360" w:lineRule="auto"/>
-              <w:rPr>
-                <w:rFonts w:cs="宋体" w:hint="eastAsia"/>
-                <w:sz w:val="24"/>
-                <w:szCs w:val="24"/>
-              </w:rPr>
-            </w:pPr>
-            <w:r>
-              <w:rPr>
-                <w:rFonts w:cs="宋体"/>
-                <w:sz w:val="24"/>
-                <w:szCs w:val="24"/>
-              </w:rPr>
-              <w:t>Accuracy</w:t>
-            </w:r>
-          </w:p>
-        </w:tc>
-        <w:tc>
-          <w:tcPr>
-            <w:tcW w:w="3456" w:type="dxa"/>
-            <w:tcMar>
-              <w:top w:w="90" w:type="dxa"/>
-              <w:left w:w="120" w:type="dxa"/>
-              <w:bottom w:w="90" w:type="dxa"/>
-              <w:right w:w="120" w:type="dxa"/>
-            </w:tcMar>
-            <w:vAlign w:val="center"/>
-          </w:tcPr>
-          <w:p>
-            <w:pPr>
-              <w:spacing w:line="360" w:lineRule="auto"/>
-              <w:rPr>
-                <w:rFonts w:cs="宋体" w:hint="eastAsia"/>
-                <w:sz w:val="24"/>
-                <w:szCs w:val="24"/>
-                <w:lang w:eastAsia="zh-CN"/>
-              </w:rPr>
-            </w:pPr>
-            <w:r>
-              <w:rPr>
-                <w:rFonts w:cs="宋体"/>
-                <w:sz w:val="24"/>
-                <w:szCs w:val="24"/>
-                <w:lang w:eastAsia="zh-CN"/>
-              </w:rPr>
-              <w:t>正确分类样本数 / 总样本数</w:t>
-            </w:r>
-          </w:p>
-        </w:tc>
-        <w:tc>
-          <w:tcPr>
-            <w:tcW w:w="3600" w:type="dxa"/>
-            <w:tcMar>
-              <w:top w:w="90" w:type="dxa"/>
-              <w:left w:w="120" w:type="dxa"/>
-              <w:bottom w:w="90" w:type="dxa"/>
-              <w:right w:w="120" w:type="dxa"/>
-            </w:tcMar>
-            <w:vAlign w:val="center"/>
-          </w:tcPr>
-          <w:p>
-            <w:pPr>
-              <w:spacing w:line="360" w:lineRule="auto"/>
-              <w:rPr>
-                <w:rFonts w:cs="宋体" w:hint="eastAsia"/>
-                <w:sz w:val="24"/>
-                <w:szCs w:val="24"/>
-              </w:rPr>
-            </w:pPr>
-            <w:proofErr w:type="spellStart"/>
-            <w:r>
-              <w:rPr>
-                <w:rFonts w:cs="宋体"/>
-                <w:sz w:val="24"/>
-                <w:szCs w:val="24"/>
-              </w:rPr>
-              <w:t>总体正确率</w:t>
-            </w:r>
-            <w:proofErr w:type="spellEnd"/>
-          </w:p>
-        </w:tc>
-      </w:tr>
-      <w:tr>
-        <w:trPr>
-          <w:jc w:val="center"/>
-        </w:trPr>
-        <w:tc>
-          <w:tcPr>
-            <w:tcW w:w="1800" w:type="dxa"/>
-            <w:tcMar>
-              <w:top w:w="90" w:type="dxa"/>
-              <w:left w:w="120" w:type="dxa"/>
-              <w:bottom w:w="90" w:type="dxa"/>
-              <w:right w:w="120" w:type="dxa"/>
-            </w:tcMar>
-            <w:vAlign w:val="center"/>
-          </w:tcPr>
-          <w:p>
-            <w:pPr>
-              <w:spacing w:line="360" w:lineRule="auto"/>
-              <w:rPr>
-                <w:rFonts w:cs="宋体" w:hint="eastAsia"/>
-                <w:sz w:val="24"/>
-                <w:szCs w:val="24"/>
-              </w:rPr>
-            </w:pPr>
-            <w:r>
-              <w:rPr>
-                <w:rFonts w:cs="宋体"/>
-                <w:sz w:val="24"/>
-                <w:szCs w:val="24"/>
-              </w:rPr>
-              <w:t>Macro-F1</w:t>
-            </w:r>
-          </w:p>
-        </w:tc>
-        <w:tc>
-          <w:tcPr>
-            <w:tcW w:w="3456" w:type="dxa"/>
-            <w:tcMar>
-              <w:top w:w="90" w:type="dxa"/>
-              <w:left w:w="120" w:type="dxa"/>
-              <w:bottom w:w="90" w:type="dxa"/>
-              <w:right w:w="120" w:type="dxa"/>
-            </w:tcMar>
-            <w:vAlign w:val="center"/>
-          </w:tcPr>
-          <w:p>
-            <w:pPr>
-              <w:spacing w:line="360" w:lineRule="auto"/>
-              <w:rPr>
-                <w:rFonts w:cs="宋体" w:hint="eastAsia"/>
-                <w:sz w:val="24"/>
-                <w:szCs w:val="24"/>
-              </w:rPr>
-            </w:pPr>
-            <w:r>
-              <w:rPr>
-                <w:rFonts w:cs="宋体"/>
-                <w:sz w:val="24"/>
-                <w:szCs w:val="24"/>
-              </w:rPr>
-              <w:t>各类别 F1 的算术平均</w:t>
-            </w:r>
-          </w:p>
-        </w:tc>
-        <w:tc>
-          <w:tcPr>
-            <w:tcW w:w="3600" w:type="dxa"/>
-            <w:tcMar>
-              <w:top w:w="90" w:type="dxa"/>
-              <w:left w:w="120" w:type="dxa"/>
-              <w:bottom w:w="90" w:type="dxa"/>
-              <w:right w:w="120" w:type="dxa"/>
-            </w:tcMar>
-            <w:vAlign w:val="center"/>
-          </w:tcPr>
-          <w:p>
-            <w:pPr>
-              <w:spacing w:line="360" w:lineRule="auto"/>
-              <w:rPr>
-                <w:rFonts w:cs="宋体" w:hint="eastAsia"/>
-                <w:sz w:val="24"/>
-                <w:szCs w:val="24"/>
-              </w:rPr>
-            </w:pPr>
-            <w:r>
-              <w:rPr>
-                <w:rFonts w:cs="宋体"/>
-                <w:sz w:val="24"/>
-                <w:szCs w:val="24"/>
-              </w:rPr>
-              <w:t>减少类别不平衡影响</w:t>
-            </w:r>
-          </w:p>
-        </w:tc>
-      </w:tr>
-      <w:tr>
-        <w:trPr>
-          <w:jc w:val="center"/>
-        </w:trPr>
-        <w:tc>
-          <w:tcPr>
-            <w:tcW w:w="1800" w:type="dxa"/>
-            <w:tcMar>
-              <w:top w:w="90" w:type="dxa"/>
-              <w:left w:w="120" w:type="dxa"/>
-              <w:bottom w:w="90" w:type="dxa"/>
-              <w:right w:w="120" w:type="dxa"/>
-            </w:tcMar>
-            <w:vAlign w:val="center"/>
-          </w:tcPr>
-          <w:p>
-            <w:pPr>
-              <w:spacing w:line="360" w:lineRule="auto"/>
-              <w:rPr>
-                <w:rFonts w:cs="宋体" w:hint="eastAsia"/>
-                <w:sz w:val="24"/>
-                <w:szCs w:val="24"/>
-              </w:rPr>
-            </w:pPr>
-            <w:r>
-              <w:rPr>
-                <w:rFonts w:cs="宋体"/>
-                <w:sz w:val="24"/>
-                <w:szCs w:val="24"/>
-              </w:rPr>
-              <w:t>Log Loss</w:t>
-            </w:r>
-          </w:p>
-        </w:tc>
-        <w:tc>
-          <w:tcPr>
-            <w:tcW w:w="3456" w:type="dxa"/>
-            <w:tcMar>
-              <w:top w:w="90" w:type="dxa"/>
-              <w:left w:w="120" w:type="dxa"/>
-              <w:bottom w:w="90" w:type="dxa"/>
-              <w:right w:w="120" w:type="dxa"/>
-            </w:tcMar>
-            <w:vAlign w:val="center"/>
-          </w:tcPr>
-          <w:p>
-            <w:pPr>
-              <w:spacing w:line="360" w:lineRule="auto"/>
-              <w:rPr>
-                <w:rFonts w:cs="宋体" w:hint="eastAsia"/>
-                <w:sz w:val="24"/>
-                <w:szCs w:val="24"/>
-              </w:rPr>
-            </w:pPr>
-            <w:r>
-              <w:rPr>
-                <w:rFonts w:cs="宋体"/>
-                <w:sz w:val="24"/>
-                <w:szCs w:val="24"/>
-              </w:rPr>
-              <w:t>−Σ y·log(p)</w:t>
-            </w:r>
-          </w:p>
-        </w:tc>
-        <w:tc>
-          <w:tcPr>
-            <w:tcW w:w="3600" w:type="dxa"/>
-            <w:tcMar>
-              <w:top w:w="90" w:type="dxa"/>
-              <w:left w:w="120" w:type="dxa"/>
-              <w:bottom w:w="90" w:type="dxa"/>
-              <w:right w:w="120" w:type="dxa"/>
-            </w:tcMar>
-            <w:vAlign w:val="center"/>
-          </w:tcPr>
-          <w:p>
-            <w:pPr>
-              <w:spacing w:line="360" w:lineRule="auto"/>
-              <w:rPr>
-                <w:rFonts w:cs="宋体" w:hint="eastAsia"/>
-                <w:sz w:val="24"/>
-                <w:szCs w:val="24"/>
-                <w:lang w:eastAsia="zh-CN"/>
-              </w:rPr>
-            </w:pPr>
-            <w:r>
-              <w:rPr>
-                <w:rFonts w:cs="宋体"/>
-                <w:sz w:val="24"/>
-                <w:szCs w:val="24"/>
-                <w:lang w:eastAsia="zh-CN"/>
-              </w:rPr>
-              <w:t>评价概率预测与训练收敛</w:t>
-            </w:r>
-          </w:p>
-        </w:tc>
-      </w:tr>
-      <w:tr>
-        <w:trPr>
-          <w:jc w:val="center"/>
-        </w:trPr>
-        <w:tc>
-          <w:tcPr>
-            <w:tcW w:w="1800" w:type="dxa"/>
-            <w:tcMar>
-              <w:top w:w="90" w:type="dxa"/>
-              <w:left w:w="120" w:type="dxa"/>
-              <w:bottom w:w="90" w:type="dxa"/>
-              <w:right w:w="120" w:type="dxa"/>
-            </w:tcMar>
-            <w:vAlign w:val="center"/>
-          </w:tcPr>
-          <w:p>
-            <w:pPr>
-              <w:spacing w:line="360" w:lineRule="auto"/>
-              <w:rPr>
-                <w:rFonts w:cs="宋体" w:hint="eastAsia"/>
-                <w:sz w:val="24"/>
-                <w:szCs w:val="24"/>
-              </w:rPr>
-            </w:pPr>
-            <w:proofErr w:type="spellStart"/>
-            <w:r>
-              <w:rPr>
-                <w:rFonts w:cs="宋体"/>
-                <w:sz w:val="24"/>
-                <w:szCs w:val="24"/>
-              </w:rPr>
-              <w:t>推理时间</w:t>
-            </w:r>
-            <w:proofErr w:type="spellEnd"/>
-          </w:p>
-        </w:tc>
-        <w:tc>
-          <w:tcPr>
-            <w:tcW w:w="3456" w:type="dxa"/>
-            <w:tcMar>
-              <w:top w:w="90" w:type="dxa"/>
-              <w:left w:w="120" w:type="dxa"/>
-              <w:bottom w:w="90" w:type="dxa"/>
-              <w:right w:w="120" w:type="dxa"/>
-            </w:tcMar>
-            <w:vAlign w:val="center"/>
-          </w:tcPr>
-          <w:p>
-            <w:pPr>
-              <w:spacing w:line="360" w:lineRule="auto"/>
-              <w:rPr>
-                <w:rFonts w:cs="宋体" w:hint="eastAsia"/>
-                <w:sz w:val="24"/>
-                <w:szCs w:val="24"/>
-                <w:lang w:eastAsia="zh-CN"/>
-              </w:rPr>
-            </w:pPr>
-            <w:r>
-              <w:rPr>
-                <w:rFonts w:cs="宋体"/>
-                <w:sz w:val="24"/>
-                <w:szCs w:val="24"/>
-                <w:lang w:eastAsia="zh-CN"/>
-              </w:rPr>
-              <w:t>多次预热后批量预测中位数</w:t>
-            </w:r>
-          </w:p>
-        </w:tc>
-        <w:tc>
-          <w:tcPr>
-            <w:tcW w:w="3600" w:type="dxa"/>
-            <w:tcMar>
-              <w:top w:w="90" w:type="dxa"/>
-              <w:left w:w="120" w:type="dxa"/>
-              <w:bottom w:w="90" w:type="dxa"/>
-              <w:right w:w="120" w:type="dxa"/>
-            </w:tcMar>
-            <w:vAlign w:val="center"/>
-          </w:tcPr>
-          <w:p>
-            <w:pPr>
-              <w:spacing w:line="360" w:lineRule="auto"/>
-              <w:rPr>
-                <w:rFonts w:cs="宋体" w:hint="eastAsia"/>
-                <w:sz w:val="24"/>
-                <w:szCs w:val="24"/>
-              </w:rPr>
-            </w:pPr>
-            <w:proofErr w:type="spellStart"/>
-            <w:r>
-              <w:rPr>
-                <w:rFonts w:cs="宋体"/>
-                <w:sz w:val="24"/>
-                <w:szCs w:val="24"/>
-              </w:rPr>
-              <w:t>评价在线预测成本</w:t>
-            </w:r>
-            <w:proofErr w:type="spellEnd"/>
-          </w:p>
-        </w:tc>
-      </w:tr>
-      <w:tr>
-        <w:trPr>
-          <w:jc w:val="center"/>
-        </w:trPr>
-        <w:tc>
-          <w:tcPr>
-            <w:tcW w:w="1800" w:type="dxa"/>
-            <w:tcMar>
-              <w:top w:w="90" w:type="dxa"/>
-              <w:left w:w="120" w:type="dxa"/>
-              <w:bottom w:w="90" w:type="dxa"/>
-              <w:right w:w="120" w:type="dxa"/>
-            </w:tcMar>
-            <w:vAlign w:val="center"/>
-          </w:tcPr>
-          <w:p>
-            <w:pPr>
-              <w:spacing w:line="360" w:lineRule="auto"/>
-              <w:rPr>
-                <w:rFonts w:cs="宋体" w:hint="eastAsia"/>
-                <w:sz w:val="24"/>
-                <w:szCs w:val="24"/>
-              </w:rPr>
-            </w:pPr>
-            <w:r>
-              <w:rPr>
-                <w:rFonts w:cs="宋体"/>
-                <w:sz w:val="24"/>
-                <w:szCs w:val="24"/>
-              </w:rPr>
-              <w:t>过拟合差距</w:t>
-            </w:r>
-          </w:p>
-        </w:tc>
-        <w:tc>
-          <w:tcPr>
-            <w:tcW w:w="3456" w:type="dxa"/>
-            <w:tcMar>
-              <w:top w:w="90" w:type="dxa"/>
-              <w:left w:w="120" w:type="dxa"/>
-              <w:bottom w:w="90" w:type="dxa"/>
-              <w:right w:w="120" w:type="dxa"/>
-            </w:tcMar>
-            <w:vAlign w:val="center"/>
-          </w:tcPr>
-          <w:p>
-            <w:pPr>
-              <w:spacing w:line="360" w:lineRule="auto"/>
-              <w:rPr>
-                <w:rFonts w:cs="宋体" w:hint="eastAsia"/>
-                <w:sz w:val="24"/>
-                <w:szCs w:val="24"/>
-              </w:rPr>
-            </w:pPr>
-            <w:r>
-              <w:rPr>
-                <w:rFonts w:cs="宋体"/>
-                <w:sz w:val="24"/>
-                <w:szCs w:val="24"/>
-              </w:rPr>
-              <w:t>训练指标 − 测试指标</w:t>
-            </w:r>
-          </w:p>
-        </w:tc>
-        <w:tc>
-          <w:tcPr>
-            <w:tcW w:w="3600" w:type="dxa"/>
-            <w:tcMar>
-              <w:top w:w="90" w:type="dxa"/>
-              <w:left w:w="120" w:type="dxa"/>
-              <w:bottom w:w="90" w:type="dxa"/>
-              <w:right w:w="120" w:type="dxa"/>
-            </w:tcMar>
-            <w:vAlign w:val="center"/>
-          </w:tcPr>
-          <w:p>
-            <w:pPr>
-              <w:spacing w:line="360" w:lineRule="auto"/>
-              <w:rPr>
-                <w:rFonts w:cs="宋体" w:hint="eastAsia"/>
-                <w:sz w:val="24"/>
-                <w:szCs w:val="24"/>
-              </w:rPr>
-            </w:pPr>
-            <w:r>
-              <w:rPr>
-                <w:rFonts w:cs="宋体"/>
-                <w:sz w:val="24"/>
-                <w:szCs w:val="24"/>
-              </w:rPr>
-              <w:t>评价泛化差距</w:t>
-            </w:r>
-          </w:p>
-        </w:tc>
-      </w:tr>
-    </w:tbl>
-    <w:p>
-      <w:pPr>
-        <w:spacing w:after="40"/>
-        <w:rPr>
-          <w:rFonts w:hint="eastAsia"/>
-        </w:rPr>
-      </w:pPr>
-    </w:p>
-    <w:p>
-      <w:pPr>
-        <w:spacing w:line="360" w:lineRule="auto"/>
-        <w:jc w:val="center"/>
-        <w:rPr>
-          <w:rFonts w:cs="宋体" w:hint="eastAsia"/>
-          <w:sz w:val="24"/>
-          <w:szCs w:val="24"/>
-          <w:lang w:eastAsia="zh-CN"/>
-        </w:rPr>
-      </w:pPr>
-      <w:r>
-        <w:rPr>
-          <w:rFonts w:cs="宋体"/>
-          <w:sz w:val="24"/>
-          <w:szCs w:val="24"/>
-          <w:lang w:eastAsia="zh-CN"/>
-        </w:rPr>
-        <w:t>表5-1 主要评价指标</w:t>
-      </w:r>
-    </w:p>
-    <w:p>
-      <w:pPr>
-        <w:pStyle w:val="21"/>
-        <w:spacing w:beforeLines="50" w:before="120" w:afterLines="50" w:line="360" w:lineRule="auto"/>
-        <w:rPr>
-          <w:rFonts w:ascii="黑体" w:eastAsia="黑体" w:hAnsi="黑体" w:cs="黑体" w:hint="eastAsia"/>
-          <w:sz w:val="28"/>
-          <w:szCs w:val="28"/>
-          <w:lang w:eastAsia="zh-CN"/>
-        </w:rPr>
-      </w:pPr>
-      <w:bookmarkStart w:id="24" w:name="_Toc233156923"/>
-      <w:r>
-        <w:rPr>
-          <w:rFonts w:ascii="黑体" w:eastAsia="黑体" w:hAnsi="黑体" w:cs="黑体"/>
-          <w:sz w:val="28"/>
-          <w:szCs w:val="28"/>
-          <w:lang w:eastAsia="zh-CN"/>
-        </w:rPr>
-        <w:t>5.3 额外对比维度</w:t>
-      </w:r>
-      <w:bookmarkEnd w:id="24"/>
-    </w:p>
-    <w:p>
-      <w:pPr>
-        <w:spacing w:line="360" w:lineRule="auto"/>
-        <w:ind w:firstLineChars="200" w:firstLine="480"/>
-        <w:rPr>
-          <w:rFonts w:cs="宋体" w:hint="eastAsia"/>
-          <w:sz w:val="24"/>
-          <w:szCs w:val="24"/>
-          <w:lang w:eastAsia="zh-CN"/>
-        </w:rPr>
-      </w:pPr>
-      <w:r>
-        <w:rPr>
-          <w:rFonts w:cs="宋体"/>
-          <w:sz w:val="24"/>
-          <w:szCs w:val="24"/>
-          <w:lang w:eastAsia="zh-CN"/>
-        </w:rPr>
-        <w:t>在要求之外，本文只保留四项信息增益较高的维度：Macro-F1、训练时间、模型文件大小和特征工程消融。训练时间与推理时间共同反映计算成本；模型大小反映存储成本；消融实验直接证明数据处理是否带来收益。</w:t>
-      </w:r>
-    </w:p>
-    <w:p>
-      <w:pPr>
-        <w:pStyle w:val="21"/>
-        <w:spacing w:beforeLines="50" w:before="120" w:afterLines="50" w:line="360" w:lineRule="auto"/>
-        <w:rPr>
-          <w:rFonts w:ascii="黑体" w:eastAsia="黑体" w:hAnsi="黑体" w:cs="黑体" w:hint="eastAsia"/>
-          <w:sz w:val="28"/>
-          <w:szCs w:val="28"/>
-        </w:rPr>
-      </w:pPr>
-      <w:bookmarkStart w:id="25" w:name="_Toc233156924"/>
-      <w:r>
-        <w:rPr>
-          <w:rFonts w:ascii="黑体" w:eastAsia="黑体" w:hAnsi="黑体" w:cs="黑体"/>
-          <w:sz w:val="28"/>
-          <w:szCs w:val="28"/>
-        </w:rPr>
-        <w:lastRenderedPageBreak/>
-        <w:t xml:space="preserve">5.4 </w:t>
-      </w:r>
-      <w:proofErr w:type="spellStart"/>
-      <w:r>
-        <w:rPr>
-          <w:rFonts w:ascii="黑体" w:eastAsia="黑体" w:hAnsi="黑体" w:cs="黑体"/>
-          <w:sz w:val="28"/>
-          <w:szCs w:val="28"/>
-        </w:rPr>
-        <w:t>鲁棒性实验</w:t>
-      </w:r>
-      <w:bookmarkEnd w:id="25"/>
-      <w:proofErr w:type="spellEnd"/>
-    </w:p>
-    <w:tbl>
-      <w:tblPr>
-        <w:tblStyle w:val="aff1"/>
-        <w:tblW w:w="0" w:type="auto"/>
-        <w:jc w:val="center"/>
-        <w:tblLayout w:type="fixed"/>
-        <w:tblLook w:val="04A0" w:firstRow="1" w:lastRow="0" w:firstColumn="1" w:lastColumn="0" w:noHBand="0" w:noVBand="1"/>
-      </w:tblPr>
-      <w:tblGrid>
-        <w:gridCol w:w="1800"/>
-        <w:gridCol w:w="2448"/>
-        <w:gridCol w:w="4536"/>
-      </w:tblGrid>
-      <w:tr>
-        <w:trPr>
-          <w:tblHeader/>
-          <w:jc w:val="center"/>
-        </w:trPr>
-        <w:tc>
-          <w:tcPr>
-            <w:tcW w:w="1800" w:type="dxa"/>
-            <w:shd w:val="clear" w:color="auto" w:fill="E9F1EC"/>
-            <w:tcMar>
-              <w:top w:w="90" w:type="dxa"/>
-              <w:left w:w="120" w:type="dxa"/>
-              <w:bottom w:w="90" w:type="dxa"/>
-              <w:right w:w="120" w:type="dxa"/>
-            </w:tcMar>
-            <w:vAlign w:val="center"/>
-          </w:tcPr>
-          <w:p>
-            <w:pPr>
-              <w:spacing w:line="360" w:lineRule="auto"/>
-              <w:rPr>
-                <w:rFonts w:cs="宋体" w:hint="eastAsia"/>
-                <w:sz w:val="24"/>
-                <w:szCs w:val="24"/>
-              </w:rPr>
-            </w:pPr>
-            <w:r>
-              <w:rPr>
-                <w:rFonts w:cs="宋体"/>
-                <w:b/>
-                <w:sz w:val="24"/>
-                <w:szCs w:val="24"/>
-              </w:rPr>
-              <w:t>噪声类型</w:t>
-            </w:r>
-          </w:p>
-        </w:tc>
-        <w:tc>
-          <w:tcPr>
-            <w:tcW w:w="2448" w:type="dxa"/>
-            <w:shd w:val="clear" w:color="auto" w:fill="E9F1EC"/>
-            <w:tcMar>
-              <w:top w:w="90" w:type="dxa"/>
-              <w:left w:w="120" w:type="dxa"/>
-              <w:bottom w:w="90" w:type="dxa"/>
-              <w:right w:w="120" w:type="dxa"/>
-            </w:tcMar>
-            <w:vAlign w:val="center"/>
-          </w:tcPr>
-          <w:p>
-            <w:pPr>
-              <w:spacing w:line="360" w:lineRule="auto"/>
-              <w:rPr>
-                <w:rFonts w:cs="宋体" w:hint="eastAsia"/>
-                <w:sz w:val="24"/>
-                <w:szCs w:val="24"/>
-              </w:rPr>
-            </w:pPr>
-            <w:r>
-              <w:rPr>
-                <w:rFonts w:cs="宋体"/>
-                <w:b/>
-                <w:sz w:val="24"/>
-                <w:szCs w:val="24"/>
-              </w:rPr>
               <w:t>强度</w:t>
             </w:r>
           </w:p>
         </w:tc>
         <w:tc>
           <w:tcPr>
-            <w:tcW w:w="4536" w:type="dxa"/>
+            <w:tcW w:w="4324" w:type="dxa"/>
             <w:shd w:val="clear" w:color="auto" w:fill="E9F1EC"/>
             <w:tcMar>
               <w:top w:w="90" w:type="dxa"/>
@@ -10558,7 +10497,7 @@
         </w:tc>
         <w:tc>
           <w:tcPr>
-            <w:tcW w:w="2448" w:type="dxa"/>
+            <w:tcW w:w="3083" w:type="dxa"/>
             <w:tcMar>
               <w:top w:w="90" w:type="dxa"/>
               <w:left w:w="120" w:type="dxa"/>
@@ -10588,7 +10527,7 @@
         </w:tc>
         <w:tc>
           <w:tcPr>
-            <w:tcW w:w="4536" w:type="dxa"/>
+            <w:tcW w:w="4324" w:type="dxa"/>
             <w:tcMar>
               <w:top w:w="90" w:type="dxa"/>
               <w:left w:w="120" w:type="dxa"/>
@@ -10668,7 +10607,7 @@
         </w:tc>
         <w:tc>
           <w:tcPr>
-            <w:tcW w:w="2448" w:type="dxa"/>
+            <w:tcW w:w="3083" w:type="dxa"/>
             <w:tcMar>
               <w:top w:w="90" w:type="dxa"/>
               <w:left w:w="120" w:type="dxa"/>
@@ -10698,7 +10637,7 @@
         </w:tc>
         <w:tc>
           <w:tcPr>
-            <w:tcW w:w="4536" w:type="dxa"/>
+            <w:tcW w:w="4324" w:type="dxa"/>
             <w:tcMar>
               <w:top w:w="90" w:type="dxa"/>
               <w:left w:w="120" w:type="dxa"/>
@@ -10767,7 +10706,7 @@
         </w:tc>
         <w:tc>
           <w:tcPr>
-            <w:tcW w:w="2448" w:type="dxa"/>
+            <w:tcW w:w="3083" w:type="dxa"/>
             <w:tcMar>
               <w:top w:w="90" w:type="dxa"/>
               <w:left w:w="120" w:type="dxa"/>
@@ -10797,7 +10736,7 @@
         </w:tc>
         <w:tc>
           <w:tcPr>
-            <w:tcW w:w="4536" w:type="dxa"/>
+            <w:tcW w:w="4324" w:type="dxa"/>
             <w:tcMar>
               <w:top w:w="90" w:type="dxa"/>
               <w:left w:w="120" w:type="dxa"/>
@@ -10862,7 +10801,7 @@
         </w:tc>
         <w:tc>
           <w:tcPr>
-            <w:tcW w:w="2448" w:type="dxa"/>
+            <w:tcW w:w="3083" w:type="dxa"/>
             <w:tcMar>
               <w:top w:w="90" w:type="dxa"/>
               <w:left w:w="120" w:type="dxa"/>
@@ -10892,7 +10831,7 @@
         </w:tc>
         <w:tc>
           <w:tcPr>
-            <w:tcW w:w="4536" w:type="dxa"/>
+            <w:tcW w:w="4324" w:type="dxa"/>
             <w:tcMar>
               <w:top w:w="90" w:type="dxa"/>
               <w:left w:w="120" w:type="dxa"/>
@@ -11091,12 +11030,12 @@
         <w:tblLook w:val="04A0" w:firstRow="1" w:lastRow="0" w:firstColumn="1" w:lastColumn="0" w:noHBand="0" w:noVBand="1"/>
       </w:tblPr>
       <w:tblGrid>
-        <w:gridCol w:w="2160"/>
-        <w:gridCol w:w="1224"/>
-        <w:gridCol w:w="1296"/>
-        <w:gridCol w:w="1224"/>
-        <w:gridCol w:w="1655"/>
-        <w:gridCol w:w="1296"/>
+        <w:gridCol w:w="1742"/>
+        <w:gridCol w:w="1701"/>
+        <w:gridCol w:w="1276"/>
+        <w:gridCol w:w="1377"/>
+        <w:gridCol w:w="1701"/>
+        <w:gridCol w:w="1648"/>
       </w:tblGrid>
       <w:tr>
         <w:trPr>
@@ -11105,7 +11044,7 @@
         </w:trPr>
         <w:tc>
           <w:tcPr>
-            <w:tcW w:w="2160" w:type="dxa"/>
+            <w:tcW w:w="1742" w:type="dxa"/>
             <w:shd w:val="clear" w:color="auto" w:fill="E9F1EC"/>
             <w:tcMar>
               <w:top w:w="90" w:type="dxa"/>
@@ -11124,6 +11063,7 @@
                 <w:szCs w:val="24"/>
               </w:rPr>
             </w:pPr>
+            <w:proofErr w:type="spellStart"/>
             <w:r>
               <w:rPr>
                 <w:rFonts w:cs="宋体"/>
@@ -11133,11 +11073,12 @@
               </w:rPr>
               <w:t>模型</w:t>
             </w:r>
+            <w:proofErr w:type="spellEnd"/>
           </w:p>
         </w:tc>
         <w:tc>
           <w:tcPr>
-            <w:tcW w:w="1224" w:type="dxa"/>
+            <w:tcW w:w="1701" w:type="dxa"/>
             <w:shd w:val="clear" w:color="auto" w:fill="E9F1EC"/>
             <w:tcMar>
               <w:top w:w="90" w:type="dxa"/>
@@ -11169,7 +11110,7 @@
         </w:tc>
         <w:tc>
           <w:tcPr>
-            <w:tcW w:w="1296" w:type="dxa"/>
+            <w:tcW w:w="1276" w:type="dxa"/>
             <w:shd w:val="clear" w:color="auto" w:fill="E9F1EC"/>
             <w:tcMar>
               <w:top w:w="90" w:type="dxa"/>
@@ -11201,7 +11142,7 @@
         </w:tc>
         <w:tc>
           <w:tcPr>
-            <w:tcW w:w="1224" w:type="dxa"/>
+            <w:tcW w:w="1377" w:type="dxa"/>
             <w:shd w:val="clear" w:color="auto" w:fill="E9F1EC"/>
             <w:tcMar>
               <w:top w:w="90" w:type="dxa"/>
@@ -11233,7 +11174,7 @@
         </w:tc>
         <w:tc>
           <w:tcPr>
-            <w:tcW w:w="1655" w:type="dxa"/>
+            <w:tcW w:w="1701" w:type="dxa"/>
             <w:shd w:val="clear" w:color="auto" w:fill="E9F1EC"/>
             <w:tcMar>
               <w:top w:w="90" w:type="dxa"/>
@@ -11265,7 +11206,7 @@
         </w:tc>
         <w:tc>
           <w:tcPr>
-            <w:tcW w:w="1296" w:type="dxa"/>
+            <w:tcW w:w="1648" w:type="dxa"/>
             <w:shd w:val="clear" w:color="auto" w:fill="E9F1EC"/>
             <w:tcMar>
               <w:top w:w="90" w:type="dxa"/>
@@ -11313,7 +11254,7 @@
         </w:trPr>
         <w:tc>
           <w:tcPr>
-            <w:tcW w:w="2160" w:type="dxa"/>
+            <w:tcW w:w="1742" w:type="dxa"/>
             <w:tcMar>
               <w:top w:w="90" w:type="dxa"/>
               <w:left w:w="120" w:type="dxa"/>
@@ -11343,7 +11284,7 @@
         </w:tc>
         <w:tc>
           <w:tcPr>
-            <w:tcW w:w="1224" w:type="dxa"/>
+            <w:tcW w:w="1701" w:type="dxa"/>
             <w:tcMar>
               <w:top w:w="90" w:type="dxa"/>
               <w:left w:w="120" w:type="dxa"/>
@@ -11373,7 +11314,7 @@
         </w:tc>
         <w:tc>
           <w:tcPr>
-            <w:tcW w:w="1296" w:type="dxa"/>
+            <w:tcW w:w="1276" w:type="dxa"/>
             <w:tcMar>
               <w:top w:w="90" w:type="dxa"/>
               <w:left w:w="120" w:type="dxa"/>
@@ -11403,7 +11344,7 @@
         </w:tc>
         <w:tc>
           <w:tcPr>
-            <w:tcW w:w="1224" w:type="dxa"/>
+            <w:tcW w:w="1377" w:type="dxa"/>
             <w:tcMar>
               <w:top w:w="90" w:type="dxa"/>
               <w:left w:w="120" w:type="dxa"/>
@@ -11433,7 +11374,7 @@
         </w:tc>
         <w:tc>
           <w:tcPr>
-            <w:tcW w:w="1655" w:type="dxa"/>
+            <w:tcW w:w="1701" w:type="dxa"/>
             <w:tcMar>
               <w:top w:w="90" w:type="dxa"/>
               <w:left w:w="120" w:type="dxa"/>
@@ -11463,7 +11404,7 @@
         </w:tc>
         <w:tc>
           <w:tcPr>
-            <w:tcW w:w="1296" w:type="dxa"/>
+            <w:tcW w:w="1648" w:type="dxa"/>
             <w:tcMar>
               <w:top w:w="90" w:type="dxa"/>
               <w:left w:w="120" w:type="dxa"/>
@@ -11498,7 +11439,7 @@
         </w:trPr>
         <w:tc>
           <w:tcPr>
-            <w:tcW w:w="2160" w:type="dxa"/>
+            <w:tcW w:w="1742" w:type="dxa"/>
             <w:tcMar>
               <w:top w:w="90" w:type="dxa"/>
               <w:left w:w="120" w:type="dxa"/>
@@ -11516,6 +11457,7 @@
                 <w:szCs w:val="24"/>
               </w:rPr>
             </w:pPr>
+            <w:proofErr w:type="spellStart"/>
             <w:r>
               <w:rPr>
                 <w:rFonts w:cs="宋体"/>
@@ -11524,11 +11466,12 @@
               </w:rPr>
               <w:t>XGBoost</w:t>
             </w:r>
+            <w:proofErr w:type="spellEnd"/>
           </w:p>
         </w:tc>
         <w:tc>
           <w:tcPr>
-            <w:tcW w:w="1224" w:type="dxa"/>
+            <w:tcW w:w="1701" w:type="dxa"/>
             <w:tcMar>
               <w:top w:w="90" w:type="dxa"/>
               <w:left w:w="120" w:type="dxa"/>
@@ -11558,7 +11501,7 @@
         </w:tc>
         <w:tc>
           <w:tcPr>
-            <w:tcW w:w="1296" w:type="dxa"/>
+            <w:tcW w:w="1276" w:type="dxa"/>
             <w:tcMar>
               <w:top w:w="90" w:type="dxa"/>
               <w:left w:w="120" w:type="dxa"/>
@@ -11588,7 +11531,7 @@
         </w:tc>
         <w:tc>
           <w:tcPr>
-            <w:tcW w:w="1224" w:type="dxa"/>
+            <w:tcW w:w="1377" w:type="dxa"/>
             <w:tcMar>
               <w:top w:w="90" w:type="dxa"/>
               <w:left w:w="120" w:type="dxa"/>
@@ -11618,7 +11561,7 @@
         </w:tc>
         <w:tc>
           <w:tcPr>
-            <w:tcW w:w="1655" w:type="dxa"/>
+            <w:tcW w:w="1701" w:type="dxa"/>
             <w:tcMar>
               <w:top w:w="90" w:type="dxa"/>
               <w:left w:w="120" w:type="dxa"/>
@@ -11648,7 +11591,7 @@
         </w:tc>
         <w:tc>
           <w:tcPr>
-            <w:tcW w:w="1296" w:type="dxa"/>
+            <w:tcW w:w="1648" w:type="dxa"/>
             <w:tcMar>
               <w:top w:w="90" w:type="dxa"/>
               <w:left w:w="120" w:type="dxa"/>
@@ -11683,7 +11626,7 @@
         </w:trPr>
         <w:tc>
           <w:tcPr>
-            <w:tcW w:w="2160" w:type="dxa"/>
+            <w:tcW w:w="1742" w:type="dxa"/>
             <w:tcMar>
               <w:top w:w="90" w:type="dxa"/>
               <w:left w:w="120" w:type="dxa"/>
@@ -11713,7 +11656,7 @@
         </w:tc>
         <w:tc>
           <w:tcPr>
-            <w:tcW w:w="1224" w:type="dxa"/>
+            <w:tcW w:w="1701" w:type="dxa"/>
             <w:tcMar>
               <w:top w:w="90" w:type="dxa"/>
               <w:left w:w="120" w:type="dxa"/>
@@ -11743,7 +11686,7 @@
         </w:tc>
         <w:tc>
           <w:tcPr>
-            <w:tcW w:w="1296" w:type="dxa"/>
+            <w:tcW w:w="1276" w:type="dxa"/>
             <w:tcMar>
               <w:top w:w="90" w:type="dxa"/>
               <w:left w:w="120" w:type="dxa"/>
@@ -11773,7 +11716,7 @@
         </w:tc>
         <w:tc>
           <w:tcPr>
-            <w:tcW w:w="1224" w:type="dxa"/>
+            <w:tcW w:w="1377" w:type="dxa"/>
             <w:tcMar>
               <w:top w:w="90" w:type="dxa"/>
               <w:left w:w="120" w:type="dxa"/>
@@ -11803,7 +11746,7 @@
         </w:tc>
         <w:tc>
           <w:tcPr>
-            <w:tcW w:w="1655" w:type="dxa"/>
+            <w:tcW w:w="1701" w:type="dxa"/>
             <w:tcMar>
               <w:top w:w="90" w:type="dxa"/>
               <w:left w:w="120" w:type="dxa"/>
@@ -11833,7 +11776,7 @@
         </w:tc>
         <w:tc>
           <w:tcPr>
-            <w:tcW w:w="1296" w:type="dxa"/>
+            <w:tcW w:w="1648" w:type="dxa"/>
             <w:tcMar>
               <w:top w:w="90" w:type="dxa"/>
               <w:left w:w="120" w:type="dxa"/>
@@ -11868,7 +11811,7 @@
         </w:trPr>
         <w:tc>
           <w:tcPr>
-            <w:tcW w:w="2160" w:type="dxa"/>
+            <w:tcW w:w="1742" w:type="dxa"/>
             <w:tcMar>
               <w:top w:w="90" w:type="dxa"/>
               <w:left w:w="120" w:type="dxa"/>
@@ -11898,7 +11841,7 @@
         </w:tc>
         <w:tc>
           <w:tcPr>
-            <w:tcW w:w="1224" w:type="dxa"/>
+            <w:tcW w:w="1701" w:type="dxa"/>
             <w:tcMar>
               <w:top w:w="90" w:type="dxa"/>
               <w:left w:w="120" w:type="dxa"/>
@@ -11928,7 +11871,7 @@
         </w:tc>
         <w:tc>
           <w:tcPr>
-            <w:tcW w:w="1296" w:type="dxa"/>
+            <w:tcW w:w="1276" w:type="dxa"/>
             <w:tcMar>
               <w:top w:w="90" w:type="dxa"/>
               <w:left w:w="120" w:type="dxa"/>
@@ -11958,7 +11901,7 @@
         </w:tc>
         <w:tc>
           <w:tcPr>
-            <w:tcW w:w="1224" w:type="dxa"/>
+            <w:tcW w:w="1377" w:type="dxa"/>
             <w:tcMar>
               <w:top w:w="90" w:type="dxa"/>
               <w:left w:w="120" w:type="dxa"/>
@@ -11988,7 +11931,7 @@
         </w:tc>
         <w:tc>
           <w:tcPr>
-            <w:tcW w:w="1655" w:type="dxa"/>
+            <w:tcW w:w="1701" w:type="dxa"/>
             <w:tcMar>
               <w:top w:w="90" w:type="dxa"/>
               <w:left w:w="120" w:type="dxa"/>
@@ -12018,7 +11961,7 @@
         </w:tc>
         <w:tc>
           <w:tcPr>
-            <w:tcW w:w="1296" w:type="dxa"/>
+            <w:tcW w:w="1648" w:type="dxa"/>
             <w:tcMar>
               <w:top w:w="90" w:type="dxa"/>
               <w:left w:w="120" w:type="dxa"/>
@@ -12053,7 +11996,7 @@
         </w:trPr>
         <w:tc>
           <w:tcPr>
-            <w:tcW w:w="2160" w:type="dxa"/>
+            <w:tcW w:w="1742" w:type="dxa"/>
             <w:tcMar>
               <w:top w:w="90" w:type="dxa"/>
               <w:left w:w="120" w:type="dxa"/>
@@ -12083,7 +12026,7 @@
         </w:tc>
         <w:tc>
           <w:tcPr>
-            <w:tcW w:w="1224" w:type="dxa"/>
+            <w:tcW w:w="1701" w:type="dxa"/>
             <w:tcMar>
               <w:top w:w="90" w:type="dxa"/>
               <w:left w:w="120" w:type="dxa"/>
@@ -12113,7 +12056,7 @@
         </w:tc>
         <w:tc>
           <w:tcPr>
-            <w:tcW w:w="1296" w:type="dxa"/>
+            <w:tcW w:w="1276" w:type="dxa"/>
             <w:tcMar>
               <w:top w:w="90" w:type="dxa"/>
               <w:left w:w="120" w:type="dxa"/>
@@ -12143,7 +12086,7 @@
         </w:tc>
         <w:tc>
           <w:tcPr>
-            <w:tcW w:w="1224" w:type="dxa"/>
+            <w:tcW w:w="1377" w:type="dxa"/>
             <w:tcMar>
               <w:top w:w="90" w:type="dxa"/>
               <w:left w:w="120" w:type="dxa"/>
@@ -12173,7 +12116,7 @@
         </w:tc>
         <w:tc>
           <w:tcPr>
-            <w:tcW w:w="1655" w:type="dxa"/>
+            <w:tcW w:w="1701" w:type="dxa"/>
             <w:tcMar>
               <w:top w:w="90" w:type="dxa"/>
               <w:left w:w="120" w:type="dxa"/>
@@ -12203,7 +12146,7 @@
         </w:tc>
         <w:tc>
           <w:tcPr>
-            <w:tcW w:w="1296" w:type="dxa"/>
+            <w:tcW w:w="1648" w:type="dxa"/>
             <w:tcMar>
               <w:top w:w="90" w:type="dxa"/>
               <w:left w:w="120" w:type="dxa"/>
@@ -13096,10 +13039,10 @@
         <w:tblLook w:val="04A0" w:firstRow="1" w:lastRow="0" w:firstColumn="1" w:lastColumn="0" w:noHBand="0" w:noVBand="1"/>
       </w:tblPr>
       <w:tblGrid>
-        <w:gridCol w:w="2592"/>
+        <w:gridCol w:w="2777"/>
         <w:gridCol w:w="1728"/>
         <w:gridCol w:w="2015"/>
-        <w:gridCol w:w="2304"/>
+        <w:gridCol w:w="2375"/>
       </w:tblGrid>
       <w:tr>
         <w:trPr>
@@ -13108,7 +13051,7 @@
         </w:trPr>
         <w:tc>
           <w:tcPr>
-            <w:tcW w:w="2592" w:type="dxa"/>
+            <w:tcW w:w="2777" w:type="dxa"/>
             <w:shd w:val="clear" w:color="auto" w:fill="E9F1EC"/>
             <w:tcMar>
               <w:top w:w="90" w:type="dxa"/>
@@ -13206,7 +13149,7 @@
         </w:tc>
         <w:tc>
           <w:tcPr>
-            <w:tcW w:w="2304" w:type="dxa"/>
+            <w:tcW w:w="2375" w:type="dxa"/>
             <w:shd w:val="clear" w:color="auto" w:fill="E9F1EC"/>
             <w:tcMar>
               <w:top w:w="90" w:type="dxa"/>
@@ -13219,6 +13162,7 @@
           <w:p>
             <w:pPr>
               <w:spacing w:line="360" w:lineRule="auto"/>
+              <w:jc w:val="center"/>
               <w:rPr>
                 <w:rFonts w:cs="宋体" w:hint="eastAsia"/>
                 <w:sz w:val="24"/>
@@ -13243,7 +13187,7 @@
         </w:trPr>
         <w:tc>
           <w:tcPr>
-            <w:tcW w:w="2592" w:type="dxa"/>
+            <w:tcW w:w="2777" w:type="dxa"/>
             <w:tcMar>
               <w:top w:w="90" w:type="dxa"/>
               <w:left w:w="120" w:type="dxa"/>
@@ -13333,7 +13277,7 @@
         </w:tc>
         <w:tc>
           <w:tcPr>
-            <w:tcW w:w="2304" w:type="dxa"/>
+            <w:tcW w:w="2375" w:type="dxa"/>
             <w:tcMar>
               <w:top w:w="90" w:type="dxa"/>
               <w:left w:w="120" w:type="dxa"/>
@@ -13345,6 +13289,7 @@
           <w:p>
             <w:pPr>
               <w:spacing w:line="360" w:lineRule="auto"/>
+              <w:jc w:val="center"/>
               <w:rPr>
                 <w:rFonts w:cs="宋体" w:hint="eastAsia"/>
                 <w:sz w:val="24"/>
@@ -13368,7 +13313,7 @@
         </w:trPr>
         <w:tc>
           <w:tcPr>
-            <w:tcW w:w="2592" w:type="dxa"/>
+            <w:tcW w:w="2777" w:type="dxa"/>
             <w:tcMar>
               <w:top w:w="90" w:type="dxa"/>
               <w:left w:w="120" w:type="dxa"/>
@@ -13458,7 +13403,7 @@
         </w:tc>
         <w:tc>
           <w:tcPr>
-            <w:tcW w:w="2304" w:type="dxa"/>
+            <w:tcW w:w="2375" w:type="dxa"/>
             <w:tcMar>
               <w:top w:w="90" w:type="dxa"/>
               <w:left w:w="120" w:type="dxa"/>
@@ -13470,6 +13415,7 @@
           <w:p>
             <w:pPr>
               <w:spacing w:line="360" w:lineRule="auto"/>
+              <w:jc w:val="center"/>
               <w:rPr>
                 <w:rFonts w:cs="宋体" w:hint="eastAsia"/>
                 <w:sz w:val="24"/>
@@ -13493,7 +13439,7 @@
         </w:trPr>
         <w:tc>
           <w:tcPr>
-            <w:tcW w:w="2592" w:type="dxa"/>
+            <w:tcW w:w="2777" w:type="dxa"/>
             <w:tcMar>
               <w:top w:w="90" w:type="dxa"/>
               <w:left w:w="120" w:type="dxa"/>
@@ -13583,7 +13529,7 @@
         </w:tc>
         <w:tc>
           <w:tcPr>
-            <w:tcW w:w="2304" w:type="dxa"/>
+            <w:tcW w:w="2375" w:type="dxa"/>
             <w:tcMar>
               <w:top w:w="90" w:type="dxa"/>
               <w:left w:w="120" w:type="dxa"/>
@@ -13595,6 +13541,7 @@
           <w:p>
             <w:pPr>
               <w:spacing w:line="360" w:lineRule="auto"/>
+              <w:jc w:val="center"/>
               <w:rPr>
                 <w:rFonts w:cs="宋体" w:hint="eastAsia"/>
                 <w:sz w:val="24"/>
@@ -13618,7 +13565,7 @@
         </w:trPr>
         <w:tc>
           <w:tcPr>
-            <w:tcW w:w="2592" w:type="dxa"/>
+            <w:tcW w:w="2777" w:type="dxa"/>
             <w:tcMar>
               <w:top w:w="90" w:type="dxa"/>
               <w:left w:w="120" w:type="dxa"/>
@@ -13708,7 +13655,7 @@
         </w:tc>
         <w:tc>
           <w:tcPr>
-            <w:tcW w:w="2304" w:type="dxa"/>
+            <w:tcW w:w="2375" w:type="dxa"/>
             <w:tcMar>
               <w:top w:w="90" w:type="dxa"/>
               <w:left w:w="120" w:type="dxa"/>
@@ -13720,6 +13667,7 @@
           <w:p>
             <w:pPr>
               <w:spacing w:line="360" w:lineRule="auto"/>
+              <w:jc w:val="center"/>
               <w:rPr>
                 <w:rFonts w:cs="宋体" w:hint="eastAsia"/>
                 <w:sz w:val="24"/>
@@ -13743,7 +13691,7 @@
         </w:trPr>
         <w:tc>
           <w:tcPr>
-            <w:tcW w:w="2592" w:type="dxa"/>
+            <w:tcW w:w="2777" w:type="dxa"/>
             <w:tcMar>
               <w:top w:w="90" w:type="dxa"/>
               <w:left w:w="120" w:type="dxa"/>
@@ -13833,7 +13781,7 @@
         </w:tc>
         <w:tc>
           <w:tcPr>
-            <w:tcW w:w="2304" w:type="dxa"/>
+            <w:tcW w:w="2375" w:type="dxa"/>
             <w:tcMar>
               <w:top w:w="90" w:type="dxa"/>
               <w:left w:w="120" w:type="dxa"/>
@@ -13845,6 +13793,7 @@
           <w:p>
             <w:pPr>
               <w:spacing w:line="360" w:lineRule="auto"/>
+              <w:jc w:val="center"/>
               <w:rPr>
                 <w:rFonts w:cs="宋体" w:hint="eastAsia"/>
                 <w:sz w:val="24"/>
@@ -13857,16 +13806,7 @@
                 <w:sz w:val="24"/>
                 <w:szCs w:val="24"/>
               </w:rPr>
-              <w:t>-0.22 个百分</w:t>
-            </w:r>
-            <w:r>
-              <w:rPr>
-                <w:rFonts w:cs="宋体"/>
-                <w:sz w:val="24"/>
-                <w:szCs w:val="24"/>
-              </w:rPr>
-              <w:lastRenderedPageBreak/>
-              <w:t>点</w:t>
+              <w:t>-0.22 个百分点</w:t>
             </w:r>
           </w:p>
         </w:tc>
@@ -13917,6 +13857,7 @@
           <w:szCs w:val="24"/>
           <w:lang w:eastAsia="zh-CN"/>
         </w:rPr>
+        <w:lastRenderedPageBreak/>
         <w:t xml:space="preserve">衍生特征对手写高斯朴素贝叶斯的提升达到 7.64 </w:t>
       </w:r>
       <w:proofErr w:type="gramStart"/>
@@ -15230,7 +15171,7 @@
         <w:tblLook w:val="04A0" w:firstRow="1" w:lastRow="0" w:firstColumn="1" w:lastColumn="0" w:noHBand="0" w:noVBand="1"/>
       </w:tblPr>
       <w:tblGrid>
-        <w:gridCol w:w="2592"/>
+        <w:gridCol w:w="2958"/>
         <w:gridCol w:w="1944"/>
         <w:gridCol w:w="1944"/>
         <w:gridCol w:w="1584"/>
@@ -15242,7 +15183,7 @@
         </w:trPr>
         <w:tc>
           <w:tcPr>
-            <w:tcW w:w="2592" w:type="dxa"/>
+            <w:tcW w:w="2958" w:type="dxa"/>
             <w:shd w:val="clear" w:color="auto" w:fill="E9F1EC"/>
             <w:tcMar>
               <w:top w:w="90" w:type="dxa"/>
@@ -15261,6 +15202,7 @@
                 <w:szCs w:val="24"/>
               </w:rPr>
             </w:pPr>
+            <w:proofErr w:type="spellStart"/>
             <w:r>
               <w:rPr>
                 <w:rFonts w:cs="宋体"/>
@@ -15270,6 +15212,7 @@
               </w:rPr>
               <w:t>模型</w:t>
             </w:r>
+            <w:proofErr w:type="spellEnd"/>
           </w:p>
         </w:tc>
         <w:tc>
@@ -15375,7 +15318,7 @@
         </w:trPr>
         <w:tc>
           <w:tcPr>
-            <w:tcW w:w="2592" w:type="dxa"/>
+            <w:tcW w:w="2958" w:type="dxa"/>
             <w:tcMar>
               <w:top w:w="90" w:type="dxa"/>
               <w:left w:w="120" w:type="dxa"/>
@@ -15500,7 +15443,7 @@
         </w:trPr>
         <w:tc>
           <w:tcPr>
-            <w:tcW w:w="2592" w:type="dxa"/>
+            <w:tcW w:w="2958" w:type="dxa"/>
             <w:tcMar>
               <w:top w:w="90" w:type="dxa"/>
               <w:left w:w="120" w:type="dxa"/>
@@ -15625,7 +15568,7 @@
         </w:trPr>
         <w:tc>
           <w:tcPr>
-            <w:tcW w:w="2592" w:type="dxa"/>
+            <w:tcW w:w="2958" w:type="dxa"/>
             <w:tcMar>
               <w:top w:w="90" w:type="dxa"/>
               <w:left w:w="120" w:type="dxa"/>
@@ -15750,7 +15693,7 @@
         </w:trPr>
         <w:tc>
           <w:tcPr>
-            <w:tcW w:w="2592" w:type="dxa"/>
+            <w:tcW w:w="2958" w:type="dxa"/>
             <w:tcMar>
               <w:top w:w="90" w:type="dxa"/>
               <w:left w:w="120" w:type="dxa"/>
@@ -15875,7 +15818,7 @@
         </w:trPr>
         <w:tc>
           <w:tcPr>
-            <w:tcW w:w="2592" w:type="dxa"/>
+            <w:tcW w:w="2958" w:type="dxa"/>
             <w:tcMar>
               <w:top w:w="90" w:type="dxa"/>
               <w:left w:w="120" w:type="dxa"/>
@@ -16193,8 +16136,8 @@
         <w:tblLook w:val="04A0" w:firstRow="1" w:lastRow="0" w:firstColumn="1" w:lastColumn="0" w:noHBand="0" w:noVBand="1"/>
       </w:tblPr>
       <w:tblGrid>
-        <w:gridCol w:w="3888"/>
-        <w:gridCol w:w="4752"/>
+        <w:gridCol w:w="4209"/>
+        <w:gridCol w:w="4785"/>
       </w:tblGrid>
       <w:tr>
         <w:trPr>
@@ -16203,7 +16146,7 @@
         </w:trPr>
         <w:tc>
           <w:tcPr>
-            <w:tcW w:w="3888" w:type="dxa"/>
+            <w:tcW w:w="4209" w:type="dxa"/>
             <w:shd w:val="clear" w:color="auto" w:fill="E9F1EC"/>
             <w:tcMar>
               <w:top w:w="90" w:type="dxa"/>
@@ -16257,7 +16200,7 @@
         </w:tc>
         <w:tc>
           <w:tcPr>
-            <w:tcW w:w="4752" w:type="dxa"/>
+            <w:tcW w:w="4785" w:type="dxa"/>
             <w:shd w:val="clear" w:color="auto" w:fill="E9F1EC"/>
             <w:tcMar>
               <w:top w:w="90" w:type="dxa"/>
@@ -16294,7 +16237,7 @@
         </w:trPr>
         <w:tc>
           <w:tcPr>
-            <w:tcW w:w="3888" w:type="dxa"/>
+            <w:tcW w:w="4209" w:type="dxa"/>
             <w:tcMar>
               <w:top w:w="90" w:type="dxa"/>
               <w:left w:w="120" w:type="dxa"/>
@@ -16324,7 +16267,7 @@
         </w:tc>
         <w:tc>
           <w:tcPr>
-            <w:tcW w:w="4752" w:type="dxa"/>
+            <w:tcW w:w="4785" w:type="dxa"/>
             <w:tcMar>
               <w:top w:w="90" w:type="dxa"/>
               <w:left w:w="120" w:type="dxa"/>
@@ -16361,7 +16304,7 @@
         </w:trPr>
         <w:tc>
           <w:tcPr>
-            <w:tcW w:w="3888" w:type="dxa"/>
+            <w:tcW w:w="4209" w:type="dxa"/>
             <w:tcMar>
               <w:top w:w="90" w:type="dxa"/>
               <w:left w:w="120" w:type="dxa"/>
@@ -16391,7 +16334,7 @@
         </w:tc>
         <w:tc>
           <w:tcPr>
-            <w:tcW w:w="4752" w:type="dxa"/>
+            <w:tcW w:w="4785" w:type="dxa"/>
             <w:tcMar>
               <w:top w:w="90" w:type="dxa"/>
               <w:left w:w="120" w:type="dxa"/>
@@ -16448,7 +16391,7 @@
         </w:trPr>
         <w:tc>
           <w:tcPr>
-            <w:tcW w:w="3888" w:type="dxa"/>
+            <w:tcW w:w="4209" w:type="dxa"/>
             <w:tcMar>
               <w:top w:w="90" w:type="dxa"/>
               <w:left w:w="120" w:type="dxa"/>
@@ -16506,7 +16449,7 @@
         </w:tc>
         <w:tc>
           <w:tcPr>
-            <w:tcW w:w="4752" w:type="dxa"/>
+            <w:tcW w:w="4785" w:type="dxa"/>
             <w:tcMar>
               <w:top w:w="90" w:type="dxa"/>
               <w:left w:w="120" w:type="dxa"/>
@@ -16543,7 +16486,7 @@
         </w:trPr>
         <w:tc>
           <w:tcPr>
-            <w:tcW w:w="3888" w:type="dxa"/>
+            <w:tcW w:w="4209" w:type="dxa"/>
             <w:tcMar>
               <w:top w:w="90" w:type="dxa"/>
               <w:left w:w="120" w:type="dxa"/>
@@ -16601,7 +16544,7 @@
         </w:tc>
         <w:tc>
           <w:tcPr>
-            <w:tcW w:w="4752" w:type="dxa"/>
+            <w:tcW w:w="4785" w:type="dxa"/>
             <w:tcMar>
               <w:top w:w="90" w:type="dxa"/>
               <w:left w:w="120" w:type="dxa"/>
@@ -16638,7 +16581,7 @@
         </w:trPr>
         <w:tc>
           <w:tcPr>
-            <w:tcW w:w="3888" w:type="dxa"/>
+            <w:tcW w:w="4209" w:type="dxa"/>
             <w:tcMar>
               <w:top w:w="90" w:type="dxa"/>
               <w:left w:w="120" w:type="dxa"/>
@@ -16668,7 +16611,7 @@
         </w:tc>
         <w:tc>
           <w:tcPr>
-            <w:tcW w:w="4752" w:type="dxa"/>
+            <w:tcW w:w="4785" w:type="dxa"/>
             <w:tcMar>
               <w:top w:w="90" w:type="dxa"/>
               <w:left w:w="120" w:type="dxa"/>
@@ -16703,7 +16646,7 @@
         </w:trPr>
         <w:tc>
           <w:tcPr>
-            <w:tcW w:w="3888" w:type="dxa"/>
+            <w:tcW w:w="4209" w:type="dxa"/>
             <w:tcMar>
               <w:top w:w="90" w:type="dxa"/>
               <w:left w:w="120" w:type="dxa"/>
@@ -16733,7 +16676,7 @@
         </w:tc>
         <w:tc>
           <w:tcPr>
-            <w:tcW w:w="4752" w:type="dxa"/>
+            <w:tcW w:w="4785" w:type="dxa"/>
             <w:tcMar>
               <w:top w:w="90" w:type="dxa"/>
               <w:left w:w="120" w:type="dxa"/>
@@ -16768,7 +16711,7 @@
         </w:trPr>
         <w:tc>
           <w:tcPr>
-            <w:tcW w:w="3888" w:type="dxa"/>
+            <w:tcW w:w="4209" w:type="dxa"/>
             <w:tcMar>
               <w:top w:w="90" w:type="dxa"/>
               <w:left w:w="120" w:type="dxa"/>
@@ -16798,7 +16741,7 @@
         </w:tc>
         <w:tc>
           <w:tcPr>
-            <w:tcW w:w="4752" w:type="dxa"/>
+            <w:tcW w:w="4785" w:type="dxa"/>
             <w:tcMar>
               <w:top w:w="90" w:type="dxa"/>
               <w:left w:w="120" w:type="dxa"/>
@@ -16989,16 +16932,7 @@
                 <w:sz w:val="24"/>
                 <w:szCs w:val="24"/>
               </w:rPr>
-              <w:t>streamlit_app_scoring.py，用于</w:t>
-            </w:r>
-            <w:r>
-              <w:rPr>
-                <w:rFonts w:cs="宋体"/>
-                <w:sz w:val="24"/>
-                <w:szCs w:val="24"/>
-              </w:rPr>
-              <w:lastRenderedPageBreak/>
-              <w:t>打开</w:t>
+              <w:t>streamlit_app_scoring.py，用于打开</w:t>
             </w:r>
             <w:proofErr w:type="spellEnd"/>
             <w:r>
@@ -17057,6 +16991,7 @@
           <w:sz w:val="24"/>
           <w:szCs w:val="24"/>
         </w:rPr>
+        <w:lastRenderedPageBreak/>
         <w:t>项目还支持 drybean analyze、drybean train、drybean ablation、drybean robustness 和 drybean plot 分阶段运行。算法运行期间仅输出命令行日志，不调用 UI；Streamlit 页面只读取 artifacts 中已经生成的结果表和图表，用于展示和截图。</w:t>
       </w:r>
     </w:p>
@@ -17894,18 +17829,34 @@
         </w:rPr>
         <w:t>README 包含项目简介、污染说明、数据处理、五算法介绍、完整结果表、关键图表、项目结构、运行命令和评分项导向的展示说明。仓库链接</w:t>
       </w:r>
-      <w:hyperlink r:id="rId31" w:history="1">
-        <w:r>
-          <w:rPr>
-            <w:rStyle w:val="aff9"/>
-            <w:rFonts w:cs="宋体"/>
-            <w:sz w:val="24"/>
-            <w:szCs w:val="24"/>
-            <w:lang w:eastAsia="zh-CN"/>
-          </w:rPr>
-          <w:t>WenYulin0418/dry-bean-ml-project</w:t>
-        </w:r>
-      </w:hyperlink>
+      <w:r>
+        <w:fldChar w:fldCharType="begin"/>
+      </w:r>
+      <w:r>
+        <w:rPr>
+          <w:lang w:eastAsia="zh-CN"/>
+        </w:rPr>
+        <w:instrText>HYPERLINK "https://github.com/WenYulin0418/dry-bean-ml-project"</w:instrText>
+      </w:r>
+      <w:r>
+        <w:rPr>
+          <w:rFonts w:hint="eastAsia"/>
+        </w:rPr>
+        <w:fldChar w:fldCharType="separate"/>
+      </w:r>
+      <w:r>
+        <w:rPr>
+          <w:rStyle w:val="aff9"/>
+          <w:rFonts w:cs="宋体"/>
+          <w:sz w:val="24"/>
+          <w:szCs w:val="24"/>
+          <w:lang w:eastAsia="zh-CN"/>
+        </w:rPr>
+        <w:t>WenYulin0418/dry-bean-ml-project</w:t>
+      </w:r>
+      <w:r>
+        <w:fldChar w:fldCharType="end"/>
+      </w:r>
       <w:r>
         <w:rPr>
           <w:rFonts w:cs="宋体"/>
@@ -18252,7 +18203,7 @@
       </w:r>
     </w:p>
     <w:sectPr>
-      <w:footerReference w:type="default" r:id="rId32"/>
+      <w:footerReference w:type="default" r:id="rId31"/>
       <w:pgSz w:w="12240" w:h="15840"/>
       <w:pgMar w:top="1224" w:right="1296" w:bottom="1152" w:left="1296" w:header="605" w:footer="605" w:gutter="0"/>
       <w:cols w:space="720"/>
@@ -19208,6 +19159,7 @@
   <w:style w:type="character" w:default="1" w:styleId="a2">
     <w:name w:val="Default Paragraph Font"/>
     <w:uiPriority w:val="1"/>
+    <w:semiHidden/>
     <w:unhideWhenUsed/>
   </w:style>
   <w:style w:type="table" w:default="1" w:styleId="a3">

</xml_diff>